<commit_message>
make the AKKON BL number dont appear in case of no input
</commit_message>
<xml_diff>
--- a/frontend/api/templates/MISE A QUAI L - AKKON.docx
+++ b/frontend/api/templates/MISE A QUAI L - AKKON.docx
@@ -256,12 +256,37 @@
                 <w:lang w:val="en-US"/>
               </w:rPr>
             </w:pPr>
-            <w:r>
-              <w:rPr>
-                <w:b/>
-                <w:bCs/>
-              </w:rPr>
-              <w:t>{{ container_marque }}</w:t>
+            <w:proofErr w:type="gramStart"/>
+            <w:r>
+              <w:rPr>
+                <w:b/>
+                <w:bCs/>
+              </w:rPr>
+              <w:t xml:space="preserve">{{ </w:t>
+            </w:r>
+            <w:proofErr w:type="spellStart"/>
+            <w:r>
+              <w:rPr>
+                <w:b/>
+                <w:bCs/>
+              </w:rPr>
+              <w:t>container</w:t>
+            </w:r>
+            <w:proofErr w:type="gramEnd"/>
+            <w:r>
+              <w:rPr>
+                <w:b/>
+                <w:bCs/>
+              </w:rPr>
+              <w:t>_marque</w:t>
+            </w:r>
+            <w:proofErr w:type="spellEnd"/>
+            <w:r>
+              <w:rPr>
+                <w:b/>
+                <w:bCs/>
+              </w:rPr>
+              <w:t xml:space="preserve"> }}</w:t>
             </w:r>
           </w:p>
         </w:tc>
@@ -294,12 +319,37 @@
                 <w:lang w:val="en-US"/>
               </w:rPr>
             </w:pPr>
-            <w:r>
-              <w:rPr>
-                <w:b/>
-                <w:bCs/>
-              </w:rPr>
-              <w:t>{{ container_number }}</w:t>
+            <w:proofErr w:type="gramStart"/>
+            <w:r>
+              <w:rPr>
+                <w:b/>
+                <w:bCs/>
+              </w:rPr>
+              <w:t xml:space="preserve">{{ </w:t>
+            </w:r>
+            <w:proofErr w:type="spellStart"/>
+            <w:r>
+              <w:rPr>
+                <w:b/>
+                <w:bCs/>
+              </w:rPr>
+              <w:t>container</w:t>
+            </w:r>
+            <w:proofErr w:type="gramEnd"/>
+            <w:r>
+              <w:rPr>
+                <w:b/>
+                <w:bCs/>
+              </w:rPr>
+              <w:t>_number</w:t>
+            </w:r>
+            <w:proofErr w:type="spellEnd"/>
+            <w:r>
+              <w:rPr>
+                <w:b/>
+                <w:bCs/>
+              </w:rPr>
+              <w:t xml:space="preserve"> }}</w:t>
             </w:r>
           </w:p>
         </w:tc>
@@ -350,7 +400,39 @@
                 <w:b/>
                 <w:bCs/>
               </w:rPr>
-              <w:t>TRANSIT : {{ transit_name }}</w:t>
+              <w:t xml:space="preserve">TRANSIT : </w:t>
+            </w:r>
+            <w:proofErr w:type="gramStart"/>
+            <w:r>
+              <w:rPr>
+                <w:b/>
+                <w:bCs/>
+              </w:rPr>
+              <w:t xml:space="preserve">{{ </w:t>
+            </w:r>
+            <w:proofErr w:type="spellStart"/>
+            <w:r>
+              <w:rPr>
+                <w:b/>
+                <w:bCs/>
+              </w:rPr>
+              <w:t>transit</w:t>
+            </w:r>
+            <w:proofErr w:type="gramEnd"/>
+            <w:r>
+              <w:rPr>
+                <w:b/>
+                <w:bCs/>
+              </w:rPr>
+              <w:t>_name</w:t>
+            </w:r>
+            <w:proofErr w:type="spellEnd"/>
+            <w:r>
+              <w:rPr>
+                <w:b/>
+                <w:bCs/>
+              </w:rPr>
+              <w:t xml:space="preserve"> }}</w:t>
             </w:r>
           </w:p>
         </w:tc>
@@ -370,7 +452,39 @@
                 <w:b/>
                 <w:bCs/>
               </w:rPr>
-              <w:t>P/C : {{ client_name }}</w:t>
+              <w:t xml:space="preserve">P/C : </w:t>
+            </w:r>
+            <w:proofErr w:type="gramStart"/>
+            <w:r>
+              <w:rPr>
+                <w:b/>
+                <w:bCs/>
+              </w:rPr>
+              <w:t xml:space="preserve">{{ </w:t>
+            </w:r>
+            <w:proofErr w:type="spellStart"/>
+            <w:r>
+              <w:rPr>
+                <w:b/>
+                <w:bCs/>
+              </w:rPr>
+              <w:t>client</w:t>
+            </w:r>
+            <w:proofErr w:type="gramEnd"/>
+            <w:r>
+              <w:rPr>
+                <w:b/>
+                <w:bCs/>
+              </w:rPr>
+              <w:t>_name</w:t>
+            </w:r>
+            <w:proofErr w:type="spellEnd"/>
+            <w:r>
+              <w:rPr>
+                <w:b/>
+                <w:bCs/>
+              </w:rPr>
+              <w:t xml:space="preserve"> }}</w:t>
             </w:r>
           </w:p>
         </w:tc>
@@ -403,20 +517,30 @@
         <w:rPr>
           <w:b/>
           <w:bCs/>
-          <w:sz w:val="28"/>
-          <w:szCs w:val="28"/>
           <w:lang w:val="en-US"/>
         </w:rPr>
-        <w:t>BL number: {{</w:t>
-      </w:r>
-      <w:r>
-        <w:rPr>
-          <w:b/>
-          <w:bCs/>
+        <w:t>BL number</w:t>
+      </w:r>
+      <w:r>
+        <w:rPr>
+          <w:b/>
+          <w:bCs/>
+          <w:sz w:val="28"/>
+          <w:szCs w:val="28"/>
           <w:lang w:val="en-US"/>
         </w:rPr>
+        <w:t>: {{</w:t>
+      </w:r>
+      <w:proofErr w:type="spellStart"/>
+      <w:r>
+        <w:rPr>
+          <w:b/>
+          <w:bCs/>
+          <w:lang w:val="en-US"/>
+        </w:rPr>
         <w:t>BL_nb</w:t>
       </w:r>
+      <w:proofErr w:type="spellEnd"/>
       <w:r>
         <w:rPr>
           <w:b/>
@@ -1016,8 +1140,19 @@
                 <w:sz w:val="28"/>
                 <w:szCs w:val="28"/>
               </w:rPr>
-              <w:t>RESTITUE (s) .le</w:t>
-            </w:r>
+              <w:t>RESTITUE (s</w:t>
+            </w:r>
+            <w:proofErr w:type="gramStart"/>
+            <w:r>
+              <w:rPr>
+                <w:b/>
+                <w:bCs/>
+                <w:sz w:val="28"/>
+                <w:szCs w:val="28"/>
+              </w:rPr>
+              <w:t>) .le</w:t>
+            </w:r>
+            <w:proofErr w:type="gramEnd"/>
           </w:p>
         </w:tc>
         <w:tc>
@@ -1158,7 +1293,15 @@
           <w:sz w:val="28"/>
           <w:szCs w:val="28"/>
         </w:rPr>
-        <w:t xml:space="preserve">                  </w:t>
+        <w:t xml:space="preserve">                 </w:t>
+      </w:r>
+      <w:proofErr w:type="gramStart"/>
+      <w:r>
+        <w:rPr>
+          <w:sz w:val="28"/>
+          <w:szCs w:val="28"/>
+        </w:rPr>
+        <w:t xml:space="preserve"> </w:t>
       </w:r>
       <w:r>
         <w:rPr>
@@ -1167,14 +1310,35 @@
         </w:rPr>
         <w:t xml:space="preserve">  {</w:t>
       </w:r>
-      <w:r>
-        <w:rPr>
-          <w:b/>
-          <w:bCs/>
-          <w:sz w:val="28"/>
-          <w:szCs w:val="28"/>
-        </w:rPr>
-        <w:t>{company_name}}</w:t>
+      <w:proofErr w:type="gramEnd"/>
+      <w:r>
+        <w:rPr>
+          <w:b/>
+          <w:bCs/>
+          <w:sz w:val="28"/>
+          <w:szCs w:val="28"/>
+        </w:rPr>
+        <w:t>{</w:t>
+      </w:r>
+      <w:proofErr w:type="spellStart"/>
+      <w:r>
+        <w:rPr>
+          <w:b/>
+          <w:bCs/>
+          <w:sz w:val="28"/>
+          <w:szCs w:val="28"/>
+        </w:rPr>
+        <w:t>company_name</w:t>
+      </w:r>
+      <w:proofErr w:type="spellEnd"/>
+      <w:r>
+        <w:rPr>
+          <w:b/>
+          <w:bCs/>
+          <w:sz w:val="28"/>
+          <w:szCs w:val="28"/>
+        </w:rPr>
+        <w:t>}}</w:t>
       </w:r>
     </w:p>
     <w:sectPr>

</xml_diff>

<commit_message>
Templates dated 2026; DCP weight typed in kg
- MISE A QUAI L, MISE A QUAI L - AKKON, LETTRE D'ENGAGEMENT: the static
  year 2025 is now 2026 (only that digit changed; nothing else in the files).
- DCP form: field (6) is labelled الوزن on screen and typed in kg; leaving
  the box shows it in tonnes (17255 -> 17.255 طن). The form still sends
  الكمية in tonnes, so DCP.docx, the PDF and the server are unchanged.

Co-Authored-By: Claude Opus 5.5 <noreply@anthropic.com>
Claude-Session: https://claude.ai/code/session_015r1hPRAEmxLVMfD5GJgbK5
</commit_message>
<xml_diff>
--- a/frontend/api/templates/MISE A QUAI L - AKKON.docx
+++ b/frontend/api/templates/MISE A QUAI L - AKKON.docx
@@ -764,7 +764,7 @@
           <w:sz w:val="28"/>
           <w:szCs w:val="28"/>
         </w:rPr>
-        <w:t>5</w:t>
+        <w:t>6</w:t>
       </w:r>
     </w:p>
     <w:p>
@@ -1063,7 +1063,7 @@
           <w:sz w:val="28"/>
           <w:szCs w:val="28"/>
         </w:rPr>
-        <w:t>5</w:t>
+        <w:t>6</w:t>
       </w:r>
     </w:p>
     <w:p>

</xml_diff>